<commit_message>
fix: prove DOCX list fidelity
</commit_message>
<xml_diff>
--- a/fixtures/email-fidelity.docx
+++ b/fixtures/email-fidelity.docx
@@ -30,6 +30,50 @@
       </w:hyperlink>
     </w:p>
     <w:p/>
+    <w:p>
+      <w:pPr>
+        <w:numPr>
+          <w:ilvl w:val="0"/>
+          <w:numId w:val="7"/>
+        </w:numPr>
+      </w:pPr>
+      <w:r>
+        <w:t>項目符號清單一</w:t>
+      </w:r>
+    </w:p>
+    <w:p>
+      <w:pPr>
+        <w:numPr>
+          <w:ilvl w:val="0"/>
+          <w:numId w:val="7"/>
+        </w:numPr>
+      </w:pPr>
+      <w:r>
+        <w:t>項目符號清單二</w:t>
+      </w:r>
+    </w:p>
+    <w:p>
+      <w:pPr>
+        <w:numPr>
+          <w:ilvl w:val="0"/>
+          <w:numId w:val="8"/>
+        </w:numPr>
+      </w:pPr>
+      <w:r>
+        <w:t>編號清單一</w:t>
+      </w:r>
+    </w:p>
+    <w:p>
+      <w:pPr>
+        <w:numPr>
+          <w:ilvl w:val="0"/>
+          <w:numId w:val="8"/>
+        </w:numPr>
+      </w:pPr>
+      <w:r>
+        <w:t>編號清單二</w:t>
+      </w:r>
+    </w:p>
     <w:tbl>
       <w:tr>
         <w:tc>
@@ -44,4 +88,27 @@
     <w:sectPr/>
   </w:body>
 </w:document>
+</file>
+
+<file path=word/numbering.xml><?xml version="1.0" encoding="utf-8"?>
+<w:numbering xmlns:w="http://schemas.openxmlformats.org/wordprocessingml/2006/main">
+  <w:abstractNum w:abstractNumId="1">
+    <w:lvl w:ilvl="0">
+      <w:numFmt w:val="bullet"/>
+      <w:lvlText w:val=""/>
+    </w:lvl>
+  </w:abstractNum>
+  <w:abstractNum w:abstractNumId="2">
+    <w:lvl w:ilvl="0">
+      <w:numFmt w:val="decimal"/>
+      <w:lvlText w:val="%1."/>
+    </w:lvl>
+  </w:abstractNum>
+  <w:num w:numId="7">
+    <w:abstractNumId w:val="1"/>
+  </w:num>
+  <w:num w:numId="8">
+    <w:abstractNumId w:val="2"/>
+  </w:num>
+</w:numbering>
 </file>
</xml_diff>